<commit_message>
Feature catalogue target - add 'Mixin' as class category / type
closes #504

Signed-off-by: Johannes Echterhoff <echterhoff@interactive-instruments.de>
</commit_message>
<xml_diff>
--- a/shapechange-app/src/integrationtests/featureCatalogue/inheritedConstraints/reference/results/docx/IDENTITY/test_inheritedConstraints.docx
+++ b/shapechange-app/src/integrationtests/featureCatalogue/inheritedConstraints/reference/results/docx/IDENTITY/test_inheritedConstraints.docx
@@ -1,6 +1,6 @@
 
 <file path=word/document.xml><?xml version="1.0" encoding="utf-8"?>
-<w:document xmlns:wpc="http://schemas.microsoft.com/office/word/2010/wordprocessingCanvas" xmlns:mc="http://schemas.openxmlformats.org/markup-compatibility/2006" xmlns:o="urn:schemas-microsoft-com:office:office" xmlns:r="http://schemas.openxmlformats.org/officeDocument/2006/relationships" xmlns:m="http://schemas.openxmlformats.org/officeDocument/2006/math" xmlns:v="urn:schemas-microsoft-com:vml" xmlns:wp14="http://schemas.microsoft.com/office/word/2010/wordprocessingDrawing" xmlns:wp="http://schemas.openxmlformats.org/drawingml/2006/wordprocessingDrawing" xmlns:w10="urn:schemas-microsoft-com:office:word" xmlns:w="http://schemas.openxmlformats.org/wordprocessingml/2006/main" xmlns:w14="http://schemas.microsoft.com/office/word/2010/wordml" xmlns:w15="http://schemas.microsoft.com/office/word/2012/wordml" xmlns:wpg="http://schemas.microsoft.com/office/word/2010/wordprocessingGroup" xmlns:wpi="http://schemas.microsoft.com/office/word/2010/wordprocessingInk" xmlns:wne="http://schemas.microsoft.com/office/word/2006/wordml" xmlns:wps="http://schemas.microsoft.com/office/word/2010/wordprocessingShape" mc:Ignorable="w14 w15 wp14">
+<w:document xmlns:m="http://schemas.openxmlformats.org/officeDocument/2006/math" xmlns:mc="http://schemas.openxmlformats.org/markup-compatibility/2006" xmlns:o="urn:schemas-microsoft-com:office:office" xmlns:r="http://schemas.openxmlformats.org/officeDocument/2006/relationships" xmlns:v="urn:schemas-microsoft-com:vml" xmlns:w="http://schemas.openxmlformats.org/wordprocessingml/2006/main" xmlns:w10="urn:schemas-microsoft-com:office:word" xmlns:w14="http://schemas.microsoft.com/office/word/2010/wordml" xmlns:w15="http://schemas.microsoft.com/office/word/2012/wordml" xmlns:wne="http://schemas.microsoft.com/office/word/2006/wordml" xmlns:wp="http://schemas.openxmlformats.org/drawingml/2006/wordprocessingDrawing" xmlns:wp14="http://schemas.microsoft.com/office/word/2010/wordprocessingDrawing" xmlns:wpc="http://schemas.microsoft.com/office/word/2010/wordprocessingCanvas" xmlns:wpg="http://schemas.microsoft.com/office/word/2010/wordprocessingGroup" xmlns:wpi="http://schemas.microsoft.com/office/word/2010/wordprocessingInk" xmlns:wps="http://schemas.microsoft.com/office/word/2010/wordprocessingShape" mc:Ignorable="w14 w15 wp14">
   <w:body>
     <w:p>
       <w:pPr>
@@ -1207,6 +1207,34 @@
                   </w:r>
                   <w:r>
                     <w:fldChar w:fldCharType="end"/>
+                  </w:r>
+                </w:p>
+              </w:tc>
+            </w:tr>
+            <w:tr>
+              <w:tc>
+                <w:tcPr>
+                  <w:tcW w:type="pct" w:w="1500"/>
+                </w:tcPr>
+                <w:p>
+                  <w:pPr>
+                    <w:ind w:left="425"/>
+                  </w:pPr>
+                  <w:r>
+                    <w:rPr>
+                      <w:b/>
+                    </w:rPr>
+                    <w:t>Type:</w:t>
+                  </w:r>
+                </w:p>
+              </w:tc>
+              <w:tc>
+                <w:tcPr>
+                  <w:tcW w:type="pct" w:w="3500"/>
+                </w:tcPr>
+                <w:p>
+                  <w:r>
+                    <w:t>Mixin</w:t>
                   </w:r>
                 </w:p>
               </w:tc>

</xml_diff>